<commit_message>
Update new test case
</commit_message>
<xml_diff>
--- a/docs/Student_Test_Case_Condition5-8.docx
+++ b/docs/Student_Test_Case_Condition5-8.docx
@@ -52,26 +52,6 @@
           <w:bCs w:val="1"/>
           <w:rtl w:val="0"/>
         </w:rPr>
-        <w:t xml:space="preserve">Shared valid data:</w:t>
-      </w:r>
-      <w:r>
-        <w:rPr>
-          <w:rtl w:val="0"/>
-        </w:rPr>
-        <w:t xml:space="preserve"> description="write three paragraphs", points=1, submissionType="pdf", group=false, groupingName="", publish="20/11/2026 09:00", due="23/11/2026 09:00", hide="24/11/2026 09:00". Assessment names and any changed values are specified below.</w:t>
-      </w:r>
-    </w:p>
-    <w:p>
-      <w:pPr>
-        <w:spacing w:after="240" w:before="240" w:lineRule="auto"/>
-        <w:rPr/>
-      </w:pPr>
-      <w:r>
-        <w:rPr>
-          <w:b w:val="1"/>
-          <w:bCs w:val="1"/>
-          <w:rtl w:val="0"/>
-        </w:rPr>
         <w:t xml:space="preserve">Preconditions:</w:t>
       </w:r>
       <w:r>
@@ -81,23 +61,12 @@
         <w:t xml:space="preserve"> Each test starts with an empty course. Before each test, an independent course accepts a valid 50-point assessment and correctly stores all nine attributes. Each case also verifies its own valid setup before attempting invalid data.</w:t>
       </w:r>
     </w:p>
-    <w:p>
-      <w:pPr>
-        <w:spacing w:after="100" w:lineRule="auto"/>
-        <w:rPr/>
-      </w:pPr>
-      <w:r>
-        <w:rPr>
-          <w:rtl w:val="0"/>
-        </w:rPr>
-      </w:r>
-    </w:p>
     <w:tbl>
       <w:tblPr>
         <w:tblStyle w:val="Table1"/>
-        <w:tblW w:w="9375.0" w:type="dxa"/>
+        <w:tblW w:w="10125.0" w:type="dxa"/>
         <w:jc w:val="left"/>
-        <w:tblInd w:w="-480.0" w:type="dxa"/>
+        <w:tblInd w:w="-795.0" w:type="dxa"/>
         <w:tblBorders>
           <w:top w:color="000000" w:space="0" w:sz="0" w:val="nil"/>
           <w:left w:color="000000" w:space="0" w:sz="0" w:val="nil"/>
@@ -110,18 +79,18 @@
         <w:tblLook w:val="0600"/>
       </w:tblPr>
       <w:tblGrid>
-        <w:gridCol w:w="1755"/>
-        <w:gridCol w:w="2415"/>
-        <w:gridCol w:w="2010"/>
-        <w:gridCol w:w="1860"/>
-        <w:gridCol w:w="1335"/>
+        <w:gridCol w:w="1770"/>
+        <w:gridCol w:w="2760"/>
+        <w:gridCol w:w="2340"/>
+        <w:gridCol w:w="2040"/>
+        <w:gridCol w:w="1215"/>
         <w:tblGridChange w:id="0">
           <w:tblGrid>
-            <w:gridCol w:w="1755"/>
-            <w:gridCol w:w="2415"/>
-            <w:gridCol w:w="2010"/>
-            <w:gridCol w:w="1860"/>
-            <w:gridCol w:w="1335"/>
+            <w:gridCol w:w="1770"/>
+            <w:gridCol w:w="2760"/>
+            <w:gridCol w:w="2340"/>
+            <w:gridCol w:w="2040"/>
+            <w:gridCol w:w="1215"/>
           </w:tblGrid>
         </w:tblGridChange>
       </w:tblGrid>
@@ -363,7 +332,24 @@
                 <w:szCs w:val="16"/>
                 <w:rtl w:val="0"/>
               </w:rPr>
-              <w:t xml:space="preserve">TC05 | Condition 5: maximum 50 points per assessment </w:t>
+              <w:t xml:space="preserve">TC05 | Condition 5:</w:t>
+            </w:r>
+          </w:p>
+          <w:p>
+            <w:pPr>
+              <w:spacing w:after="20" w:before="20" w:lineRule="auto"/>
+              <w:rPr>
+                <w:sz w:val="16"/>
+                <w:szCs w:val="16"/>
+              </w:rPr>
+            </w:pPr>
+            <w:r>
+              <w:rPr>
+                <w:sz w:val="16"/>
+                <w:szCs w:val="16"/>
+                <w:rtl w:val="0"/>
+              </w:rPr>
+              <w:t xml:space="preserve">Check the function with assessment points above 50. </w:t>
             </w:r>
           </w:p>
         </w:tc>
@@ -397,7 +383,145 @@
                 <w:szCs w:val="16"/>
                 <w:rtl w:val="0"/>
               </w:rPr>
-              <w:t xml:space="preserve">Store "existing assessment" with points=1. Attempt "boundary assessment" with points=51. The name is unique and the proposed total is 52. The independent precondition checks that points=50 is accepted. </w:t>
+              <w:t xml:space="preserve">Precondition: start with an empty course. Complete the shared baseline check described above/</w:t>
+            </w:r>
+          </w:p>
+          <w:p>
+            <w:pPr>
+              <w:spacing w:after="20" w:before="20" w:lineRule="auto"/>
+              <w:rPr>
+                <w:sz w:val="16"/>
+                <w:szCs w:val="16"/>
+              </w:rPr>
+            </w:pPr>
+            <w:r>
+              <w:rPr>
+                <w:rtl w:val="0"/>
+              </w:rPr>
+            </w:r>
+          </w:p>
+          <w:p>
+            <w:pPr>
+              <w:spacing w:after="20" w:before="20" w:lineRule="auto"/>
+              <w:rPr>
+                <w:sz w:val="16"/>
+                <w:szCs w:val="16"/>
+              </w:rPr>
+            </w:pPr>
+            <w:r>
+              <w:rPr>
+                <w:sz w:val="16"/>
+                <w:szCs w:val="16"/>
+                <w:rtl w:val="0"/>
+              </w:rPr>
+              <w:t xml:space="preserve">Setup store one existing assessment: (“existing assessment”,”write three paragraphs”, 1, “pdf”, false, “ “, “20/11/2026 09:00”, “23/11/2026 09:00”, “24/11/2026 09:00”)</w:t>
+            </w:r>
+          </w:p>
+          <w:p>
+            <w:pPr>
+              <w:spacing w:after="20" w:before="20" w:lineRule="auto"/>
+              <w:rPr>
+                <w:sz w:val="16"/>
+                <w:szCs w:val="16"/>
+              </w:rPr>
+            </w:pPr>
+            <w:r>
+              <w:rPr>
+                <w:rtl w:val="0"/>
+              </w:rPr>
+            </w:r>
+          </w:p>
+          <w:p>
+            <w:pPr>
+              <w:spacing w:after="20" w:before="20" w:lineRule="auto"/>
+              <w:rPr>
+                <w:sz w:val="16"/>
+                <w:szCs w:val="16"/>
+              </w:rPr>
+            </w:pPr>
+            <w:r>
+              <w:rPr>
+                <w:sz w:val="16"/>
+                <w:szCs w:val="16"/>
+                <w:rtl w:val="0"/>
+              </w:rPr>
+              <w:t xml:space="preserve">Assert one stored object with all nine attributes matching the setup tuple.</w:t>
+            </w:r>
+          </w:p>
+          <w:p>
+            <w:pPr>
+              <w:spacing w:after="20" w:before="20" w:lineRule="auto"/>
+              <w:rPr>
+                <w:sz w:val="16"/>
+                <w:szCs w:val="16"/>
+              </w:rPr>
+            </w:pPr>
+            <w:r>
+              <w:rPr>
+                <w:rtl w:val="0"/>
+              </w:rPr>
+            </w:r>
+          </w:p>
+          <w:p>
+            <w:pPr>
+              <w:spacing w:after="20" w:before="20" w:lineRule="auto"/>
+              <w:rPr>
+                <w:sz w:val="16"/>
+                <w:szCs w:val="16"/>
+              </w:rPr>
+            </w:pPr>
+            <w:r>
+              <w:rPr>
+                <w:sz w:val="16"/>
+                <w:szCs w:val="16"/>
+                <w:rtl w:val="0"/>
+              </w:rPr>
+              <w:t xml:space="preserve">D1-first invalid value above 50: (“boundary assessment”, “write three paragraphs”, 51, “pdf”, false, “ “, “20/11/2026 09:00”. “23/11/2026 09:00”. “24/11/2026 09:00”)</w:t>
+            </w:r>
+          </w:p>
+          <w:p>
+            <w:pPr>
+              <w:spacing w:after="20" w:before="20" w:lineRule="auto"/>
+              <w:rPr>
+                <w:sz w:val="16"/>
+                <w:szCs w:val="16"/>
+              </w:rPr>
+            </w:pPr>
+            <w:r>
+              <w:rPr>
+                <w:rtl w:val="0"/>
+              </w:rPr>
+            </w:r>
+          </w:p>
+          <w:p>
+            <w:pPr>
+              <w:spacing w:after="20" w:before="20" w:lineRule="auto"/>
+              <w:rPr>
+                <w:sz w:val="16"/>
+                <w:szCs w:val="16"/>
+              </w:rPr>
+            </w:pPr>
+            <w:r>
+              <w:rPr>
+                <w:sz w:val="16"/>
+                <w:szCs w:val="16"/>
+                <w:rtl w:val="0"/>
+              </w:rPr>
+              <w:t xml:space="preserve">The proposed total is 1 + 51 = 52. The name is unique, so the total points and duplicate name rules do not cause rejection. </w:t>
+            </w:r>
+          </w:p>
+          <w:p>
+            <w:pPr>
+              <w:spacing w:after="20" w:before="20" w:lineRule="auto"/>
+              <w:rPr>
+                <w:sz w:val="16"/>
+                <w:szCs w:val="16"/>
+              </w:rPr>
+            </w:pPr>
+            <w:r>
+              <w:rPr>
+                <w:rtl w:val="0"/>
+              </w:rPr>
             </w:r>
           </w:p>
         </w:tc>
@@ -431,7 +555,69 @@
                 <w:szCs w:val="16"/>
                 <w:rtl w:val="0"/>
               </w:rPr>
-              <w:t xml:space="preserve">50 points is accepted. The 51-point attempt returns false; list remains size 1; the existing object and all nine attributes remain unchanged. </w:t>
+              <w:t xml:space="preserve">Valid boundary : the independent 50 points baseline returns true; exactly one object is stored with all nine attributes matching its inputs.</w:t>
+            </w:r>
+          </w:p>
+          <w:p>
+            <w:pPr>
+              <w:spacing w:after="20" w:before="20" w:lineRule="auto"/>
+              <w:rPr>
+                <w:sz w:val="16"/>
+                <w:szCs w:val="16"/>
+              </w:rPr>
+            </w:pPr>
+            <w:r>
+              <w:rPr>
+                <w:rtl w:val="0"/>
+              </w:rPr>
+            </w:r>
+          </w:p>
+          <w:p>
+            <w:pPr>
+              <w:spacing w:after="20" w:before="20" w:lineRule="auto"/>
+              <w:rPr>
+                <w:sz w:val="16"/>
+                <w:szCs w:val="16"/>
+              </w:rPr>
+            </w:pPr>
+            <w:r>
+              <w:rPr>
+                <w:sz w:val="16"/>
+                <w:szCs w:val="16"/>
+                <w:rtl w:val="0"/>
+              </w:rPr>
+              <w:t xml:space="preserve">Setup: returns true; list size become 1/</w:t>
+            </w:r>
+          </w:p>
+          <w:p>
+            <w:pPr>
+              <w:spacing w:after="20" w:before="20" w:lineRule="auto"/>
+              <w:rPr>
+                <w:sz w:val="16"/>
+                <w:szCs w:val="16"/>
+              </w:rPr>
+            </w:pPr>
+            <w:r>
+              <w:rPr>
+                <w:rtl w:val="0"/>
+              </w:rPr>
+            </w:r>
+          </w:p>
+          <w:p>
+            <w:pPr>
+              <w:spacing w:after="20" w:before="20" w:lineRule="auto"/>
+              <w:rPr>
+                <w:sz w:val="16"/>
+                <w:szCs w:val="16"/>
+              </w:rPr>
+            </w:pPr>
+            <w:r>
+              <w:rPr>
+                <w:sz w:val="16"/>
+                <w:szCs w:val="16"/>
+                <w:rtl w:val="0"/>
+              </w:rPr>
+              <w:t xml:space="preserve">D1: returns false. No new assessment is stored. List size remains 1 and total points remain 1. The existing object, its position and all nine attributes remain unchanged. </w:t>
             </w:r>
           </w:p>
         </w:tc>
@@ -465,7 +651,73 @@
                 <w:szCs w:val="16"/>
                 <w:rtl w:val="0"/>
               </w:rPr>
-              <w:t xml:space="preserve">50 points accepted; 51 points rejected. List size remained 1; existing object and all attributes unchanged. </w:t>
+              <w:t xml:space="preserve">Baseline: 50 points returned true; all nine fields matched.</w:t>
+            </w:r>
+          </w:p>
+          <w:p>
+            <w:pPr>
+              <w:spacing w:after="20" w:before="20" w:lineRule="auto"/>
+              <w:rPr>
+                <w:sz w:val="16"/>
+                <w:szCs w:val="16"/>
+              </w:rPr>
+            </w:pPr>
+            <w:r>
+              <w:rPr>
+                <w:rtl w:val="0"/>
+              </w:rPr>
+            </w:r>
+          </w:p>
+          <w:p>
+            <w:pPr>
+              <w:spacing w:after="20" w:before="20" w:lineRule="auto"/>
+              <w:rPr>
+                <w:sz w:val="16"/>
+                <w:szCs w:val="16"/>
+              </w:rPr>
+            </w:pPr>
+            <w:r>
+              <w:rPr>
+                <w:sz w:val="16"/>
+                <w:szCs w:val="16"/>
+                <w:rtl w:val="0"/>
+              </w:rPr>
+              <w:t xml:space="preserve">Setup: returned true.</w:t>
+            </w:r>
+          </w:p>
+          <w:p>
+            <w:pPr>
+              <w:spacing w:after="20" w:before="20" w:lineRule="auto"/>
+              <w:rPr>
+                <w:sz w:val="16"/>
+                <w:szCs w:val="16"/>
+              </w:rPr>
+            </w:pPr>
+            <w:r>
+              <w:rPr>
+                <w:sz w:val="16"/>
+                <w:szCs w:val="16"/>
+                <w:rtl w:val="0"/>
+              </w:rPr>
+              <w:br w:type="textWrapping"/>
+              <w:t xml:space="preserve">D1: 51 points returned false. Size stayed 1; total stayed 1.</w:t>
+            </w:r>
+          </w:p>
+          <w:p>
+            <w:pPr>
+              <w:spacing w:after="20" w:before="20" w:lineRule="auto"/>
+              <w:rPr>
+                <w:sz w:val="16"/>
+                <w:szCs w:val="16"/>
+              </w:rPr>
+            </w:pPr>
+            <w:r>
+              <w:rPr>
+                <w:sz w:val="16"/>
+                <w:szCs w:val="16"/>
+                <w:rtl w:val="0"/>
+              </w:rPr>
+              <w:t xml:space="preserve">The existing object and all nine fields were unchanged. </w:t>
             </w:r>
           </w:p>
         </w:tc>
@@ -540,7 +792,7 @@
                 <w:szCs w:val="16"/>
                 <w:rtl w:val="0"/>
               </w:rPr>
-              <w:t xml:space="preserve">TC06 | Condition 6: maximum 100 total points </w:t>
+              <w:t xml:space="preserve">TC06 | Condition 6: Check the function when total assessment points exceed 100. </w:t>
             </w:r>
           </w:p>
         </w:tc>
@@ -574,7 +826,244 @@
                 <w:szCs w:val="16"/>
                 <w:rtl w:val="0"/>
               </w:rPr>
-              <w:t xml:space="preserve">Store "first assessment" with 50 points and "second assessment" with 49. Add "third assessment" with 1 point, reaching 100. Attempt "fourth assessment" with 1 point, which would total 101. </w:t>
+              <w:t xml:space="preserve">Precondition: start with an empty course; run the shared baseline check on an independent course.</w:t>
+            </w:r>
+          </w:p>
+          <w:p>
+            <w:pPr>
+              <w:spacing w:after="20" w:before="20" w:lineRule="auto"/>
+              <w:rPr>
+                <w:sz w:val="16"/>
+                <w:szCs w:val="16"/>
+              </w:rPr>
+            </w:pPr>
+            <w:r>
+              <w:rPr>
+                <w:rtl w:val="0"/>
+              </w:rPr>
+            </w:r>
+          </w:p>
+          <w:p>
+            <w:pPr>
+              <w:spacing w:after="20" w:before="20" w:lineRule="auto"/>
+              <w:rPr>
+                <w:sz w:val="16"/>
+                <w:szCs w:val="16"/>
+              </w:rPr>
+            </w:pPr>
+            <w:r>
+              <w:rPr>
+                <w:sz w:val="16"/>
+                <w:szCs w:val="16"/>
+                <w:rtl w:val="0"/>
+              </w:rPr>
+              <w:t xml:space="preserve">Setup 1:</w:t>
+            </w:r>
+          </w:p>
+          <w:p>
+            <w:pPr>
+              <w:spacing w:after="20" w:before="20" w:lineRule="auto"/>
+              <w:rPr>
+                <w:sz w:val="16"/>
+                <w:szCs w:val="16"/>
+              </w:rPr>
+            </w:pPr>
+            <w:r>
+              <w:rPr>
+                <w:sz w:val="16"/>
+                <w:szCs w:val="16"/>
+                <w:rtl w:val="0"/>
+              </w:rPr>
+              <w:t xml:space="preserve">(“first assessment”, “write three paragraphs”, 50, “pdf”, false, “ “, “20/11/2026 09:00”. “23/11/2026 09:00”. “24/11/2026 09:00”)</w:t>
+            </w:r>
+          </w:p>
+          <w:p>
+            <w:pPr>
+              <w:spacing w:after="20" w:before="20" w:lineRule="auto"/>
+              <w:rPr>
+                <w:sz w:val="16"/>
+                <w:szCs w:val="16"/>
+              </w:rPr>
+            </w:pPr>
+            <w:r>
+              <w:rPr>
+                <w:rtl w:val="0"/>
+              </w:rPr>
+            </w:r>
+          </w:p>
+          <w:p>
+            <w:pPr>
+              <w:spacing w:after="20" w:before="20" w:lineRule="auto"/>
+              <w:rPr>
+                <w:sz w:val="16"/>
+                <w:szCs w:val="16"/>
+              </w:rPr>
+            </w:pPr>
+            <w:r>
+              <w:rPr>
+                <w:sz w:val="16"/>
+                <w:szCs w:val="16"/>
+                <w:rtl w:val="0"/>
+              </w:rPr>
+              <w:t xml:space="preserve">Setup 2: </w:t>
+            </w:r>
+          </w:p>
+          <w:p>
+            <w:pPr>
+              <w:spacing w:after="20" w:before="20" w:lineRule="auto"/>
+              <w:rPr>
+                <w:sz w:val="16"/>
+                <w:szCs w:val="16"/>
+              </w:rPr>
+            </w:pPr>
+            <w:r>
+              <w:rPr>
+                <w:sz w:val="16"/>
+                <w:szCs w:val="16"/>
+                <w:rtl w:val="0"/>
+              </w:rPr>
+              <w:t xml:space="preserve">(“second assessment”, “write three paragraphs”, 49, “pdf”, false, “ “, “20/11/2026 09:00”. “23/11/2026 09:00”. “24/11/2026 09:00”)</w:t>
+            </w:r>
+          </w:p>
+          <w:p>
+            <w:pPr>
+              <w:spacing w:after="20" w:before="20" w:lineRule="auto"/>
+              <w:rPr>
+                <w:sz w:val="16"/>
+                <w:szCs w:val="16"/>
+              </w:rPr>
+            </w:pPr>
+            <w:r>
+              <w:rPr>
+                <w:rtl w:val="0"/>
+              </w:rPr>
+            </w:r>
+          </w:p>
+          <w:p>
+            <w:pPr>
+              <w:spacing w:after="20" w:before="20" w:lineRule="auto"/>
+              <w:rPr>
+                <w:sz w:val="16"/>
+                <w:szCs w:val="16"/>
+              </w:rPr>
+            </w:pPr>
+            <w:r>
+              <w:rPr>
+                <w:sz w:val="16"/>
+                <w:szCs w:val="16"/>
+                <w:rtl w:val="0"/>
+              </w:rPr>
+              <w:t xml:space="preserve">Assert two stored assessments and a total of 99 points</w:t>
+            </w:r>
+          </w:p>
+          <w:p>
+            <w:pPr>
+              <w:spacing w:after="20" w:before="20" w:lineRule="auto"/>
+              <w:rPr>
+                <w:sz w:val="16"/>
+                <w:szCs w:val="16"/>
+              </w:rPr>
+            </w:pPr>
+            <w:r>
+              <w:rPr>
+                <w:rtl w:val="0"/>
+              </w:rPr>
+            </w:r>
+          </w:p>
+          <w:p>
+            <w:pPr>
+              <w:spacing w:after="20" w:before="20" w:lineRule="auto"/>
+              <w:rPr>
+                <w:sz w:val="16"/>
+                <w:szCs w:val="16"/>
+              </w:rPr>
+            </w:pPr>
+            <w:r>
+              <w:rPr>
+                <w:sz w:val="16"/>
+                <w:szCs w:val="16"/>
+                <w:rtl w:val="0"/>
+              </w:rPr>
+              <w:t xml:space="preserve">Valid boundary - reaches exactly 100:</w:t>
+            </w:r>
+          </w:p>
+          <w:p>
+            <w:pPr>
+              <w:spacing w:after="20" w:before="20" w:lineRule="auto"/>
+              <w:rPr>
+                <w:sz w:val="16"/>
+                <w:szCs w:val="16"/>
+              </w:rPr>
+            </w:pPr>
+            <w:r>
+              <w:rPr>
+                <w:sz w:val="16"/>
+                <w:szCs w:val="16"/>
+                <w:rtl w:val="0"/>
+              </w:rPr>
+              <w:t xml:space="preserve">(“third assessment”, “write three paragraphs”, 1, “pdf”, false, “ “, “20/11/2026 09:00”. “23/11/2026 09:00”. “24/11/2026 09:00”)</w:t>
+            </w:r>
+          </w:p>
+          <w:p>
+            <w:pPr>
+              <w:spacing w:after="20" w:before="20" w:lineRule="auto"/>
+              <w:rPr>
+                <w:sz w:val="16"/>
+                <w:szCs w:val="16"/>
+              </w:rPr>
+            </w:pPr>
+            <w:r>
+              <w:rPr>
+                <w:rtl w:val="0"/>
+              </w:rPr>
+            </w:r>
+          </w:p>
+          <w:p>
+            <w:pPr>
+              <w:spacing w:after="20" w:before="20" w:lineRule="auto"/>
+              <w:rPr>
+                <w:sz w:val="16"/>
+                <w:szCs w:val="16"/>
+              </w:rPr>
+            </w:pPr>
+            <w:r>
+              <w:rPr>
+                <w:sz w:val="16"/>
+                <w:szCs w:val="16"/>
+                <w:rtl w:val="0"/>
+              </w:rPr>
+              <w:t xml:space="preserve">D1 - would increase the total to 101:</w:t>
+            </w:r>
+          </w:p>
+          <w:p>
+            <w:pPr>
+              <w:spacing w:after="20" w:before="20" w:lineRule="auto"/>
+              <w:rPr>
+                <w:sz w:val="16"/>
+                <w:szCs w:val="16"/>
+              </w:rPr>
+            </w:pPr>
+            <w:r>
+              <w:rPr>
+                <w:sz w:val="16"/>
+                <w:szCs w:val="16"/>
+                <w:rtl w:val="0"/>
+              </w:rPr>
+              <w:t xml:space="preserve">(“fourth assessment”, “write three paragraphs”, 1, “pdf”, false, “ “, “20/11/2026 09:00”. “23/11/2026 09:00”. “24/11/2026 09:00”)</w:t>
+            </w:r>
+          </w:p>
+          <w:p>
+            <w:pPr>
+              <w:spacing w:after="20" w:before="20" w:lineRule="auto"/>
+              <w:rPr>
+                <w:sz w:val="16"/>
+                <w:szCs w:val="16"/>
+              </w:rPr>
+            </w:pPr>
+            <w:r>
+              <w:rPr>
+                <w:rtl w:val="0"/>
+              </w:rPr>
             </w:r>
           </w:p>
         </w:tc>
@@ -608,7 +1097,69 @@
                 <w:szCs w:val="16"/>
                 <w:rtl w:val="0"/>
               </w:rPr>
-              <w:t xml:space="preserve">Total 100 is accepted. The attempt reaching 101 returns false; list remains size 3 and total remains 100; all existing objects and attributes remain unchanged. </w:t>
+              <w:t xml:space="preserve">Setup 1 and 2: each returns true; list size is 2 and total points are 99.</w:t>
+            </w:r>
+          </w:p>
+          <w:p>
+            <w:pPr>
+              <w:spacing w:after="20" w:before="20" w:lineRule="auto"/>
+              <w:rPr>
+                <w:sz w:val="16"/>
+                <w:szCs w:val="16"/>
+              </w:rPr>
+            </w:pPr>
+            <w:r>
+              <w:rPr>
+                <w:rtl w:val="0"/>
+              </w:rPr>
+            </w:r>
+          </w:p>
+          <w:p>
+            <w:pPr>
+              <w:spacing w:after="20" w:before="20" w:lineRule="auto"/>
+              <w:rPr>
+                <w:sz w:val="16"/>
+                <w:szCs w:val="16"/>
+              </w:rPr>
+            </w:pPr>
+            <w:r>
+              <w:rPr>
+                <w:sz w:val="16"/>
+                <w:szCs w:val="16"/>
+                <w:rtl w:val="0"/>
+              </w:rPr>
+              <w:t xml:space="preserve">Valid boundary: returns true; list size becomes 3 and total points become 100. All three objects contain their respective nine input values.</w:t>
+            </w:r>
+          </w:p>
+          <w:p>
+            <w:pPr>
+              <w:spacing w:after="20" w:before="20" w:lineRule="auto"/>
+              <w:rPr>
+                <w:sz w:val="16"/>
+                <w:szCs w:val="16"/>
+              </w:rPr>
+            </w:pPr>
+            <w:r>
+              <w:rPr>
+                <w:rtl w:val="0"/>
+              </w:rPr>
+            </w:r>
+          </w:p>
+          <w:p>
+            <w:pPr>
+              <w:spacing w:after="20" w:before="20" w:lineRule="auto"/>
+              <w:rPr>
+                <w:sz w:val="16"/>
+                <w:szCs w:val="16"/>
+              </w:rPr>
+            </w:pPr>
+            <w:r>
+              <w:rPr>
+                <w:sz w:val="16"/>
+                <w:szCs w:val="16"/>
+                <w:rtl w:val="0"/>
+              </w:rPr>
+              <w:t xml:space="preserve">D1: returns false. No fourth object is stored. List size remains 3 and total points remain 100. All three existing objects reference their order and all nine attributes per object remain unchanged.</w:t>
             </w:r>
           </w:p>
         </w:tc>
@@ -642,7 +1193,69 @@
                 <w:szCs w:val="16"/>
                 <w:rtl w:val="0"/>
               </w:rPr>
-              <w:t xml:space="preserve">Total 100 accepted; proposed total 101 rejected. List size remained 3, total remained 100; all existing objects and attributes unchanged. </w:t>
+              <w:t xml:space="preserve">Setup: both calls returned true; total was 99.</w:t>
+            </w:r>
+          </w:p>
+          <w:p>
+            <w:pPr>
+              <w:spacing w:after="20" w:before="20" w:lineRule="auto"/>
+              <w:rPr>
+                <w:sz w:val="16"/>
+                <w:szCs w:val="16"/>
+              </w:rPr>
+            </w:pPr>
+            <w:r>
+              <w:rPr>
+                <w:rtl w:val="0"/>
+              </w:rPr>
+            </w:r>
+          </w:p>
+          <w:p>
+            <w:pPr>
+              <w:spacing w:after="20" w:before="20" w:lineRule="auto"/>
+              <w:rPr>
+                <w:sz w:val="16"/>
+                <w:szCs w:val="16"/>
+              </w:rPr>
+            </w:pPr>
+            <w:r>
+              <w:rPr>
+                <w:sz w:val="16"/>
+                <w:szCs w:val="16"/>
+                <w:rtl w:val="0"/>
+              </w:rPr>
+              <w:t xml:space="preserve">Boundary: total 100 accepted size 3.</w:t>
+            </w:r>
+          </w:p>
+          <w:p>
+            <w:pPr>
+              <w:spacing w:after="20" w:before="20" w:lineRule="auto"/>
+              <w:rPr>
+                <w:sz w:val="16"/>
+                <w:szCs w:val="16"/>
+              </w:rPr>
+            </w:pPr>
+            <w:r>
+              <w:rPr>
+                <w:rtl w:val="0"/>
+              </w:rPr>
+            </w:r>
+          </w:p>
+          <w:p>
+            <w:pPr>
+              <w:spacing w:after="20" w:before="20" w:lineRule="auto"/>
+              <w:rPr>
+                <w:sz w:val="16"/>
+                <w:szCs w:val="16"/>
+              </w:rPr>
+            </w:pPr>
+            <w:r>
+              <w:rPr>
+                <w:sz w:val="16"/>
+                <w:szCs w:val="16"/>
+                <w:rtl w:val="0"/>
+              </w:rPr>
+              <w:t xml:space="preserve">D1: total 101 rejected (false). Size stayed 3; total stayed 100. All objects and nine fields per object were unchanged. </w:t>
             </w:r>
           </w:p>
         </w:tc>
@@ -717,7 +1330,7 @@
                 <w:szCs w:val="16"/>
                 <w:rtl w:val="0"/>
               </w:rPr>
-              <w:t xml:space="preserve">TC07 | Condition 7: permitted submission types </w:t>
+              <w:t xml:space="preserve">TC07 | Condition 7: Check the function with an unsupported or missing submission type.</w:t>
             </w:r>
           </w:p>
         </w:tc>
@@ -751,7 +1364,357 @@
                 <w:szCs w:val="16"/>
                 <w:rtl w:val="0"/>
               </w:rPr>
-              <w:t xml:space="preserve">Store "pdf assessment", "zip assessment" and "doc assessment", using the matching submission types and 1 point each. Attempt "invalid assessment" separately with submissionType="txt", "docx", "" and null. </w:t>
+              <w:t xml:space="preserve">Precondition: start with an empty course; run the shared independent baseline check. Store the three valid inputs below in order.</w:t>
+            </w:r>
+          </w:p>
+          <w:p>
+            <w:pPr>
+              <w:spacing w:after="20" w:before="20" w:lineRule="auto"/>
+              <w:rPr>
+                <w:sz w:val="16"/>
+                <w:szCs w:val="16"/>
+              </w:rPr>
+            </w:pPr>
+            <w:r>
+              <w:rPr>
+                <w:rtl w:val="0"/>
+              </w:rPr>
+            </w:r>
+          </w:p>
+          <w:p>
+            <w:pPr>
+              <w:spacing w:after="20" w:before="20" w:lineRule="auto"/>
+              <w:rPr>
+                <w:sz w:val="16"/>
+                <w:szCs w:val="16"/>
+              </w:rPr>
+            </w:pPr>
+            <w:r>
+              <w:rPr>
+                <w:sz w:val="16"/>
+                <w:szCs w:val="16"/>
+                <w:rtl w:val="0"/>
+              </w:rPr>
+              <w:t xml:space="preserve">Valid setup 1:</w:t>
+            </w:r>
+          </w:p>
+          <w:p>
+            <w:pPr>
+              <w:spacing w:after="20" w:before="20" w:lineRule="auto"/>
+              <w:rPr>
+                <w:sz w:val="16"/>
+                <w:szCs w:val="16"/>
+              </w:rPr>
+            </w:pPr>
+            <w:r>
+              <w:rPr>
+                <w:sz w:val="16"/>
+                <w:szCs w:val="16"/>
+                <w:rtl w:val="0"/>
+              </w:rPr>
+              <w:t xml:space="preserve">(“pdf assessment”, “write three paragraphs”, 1, “pdf”, false. “ “, “20/11/2026 09:00”, “23/11/2026 09:00”, “24/11/2026 09:00”)</w:t>
+            </w:r>
+          </w:p>
+          <w:p>
+            <w:pPr>
+              <w:spacing w:after="20" w:before="20" w:lineRule="auto"/>
+              <w:rPr>
+                <w:sz w:val="16"/>
+                <w:szCs w:val="16"/>
+              </w:rPr>
+            </w:pPr>
+            <w:r>
+              <w:rPr>
+                <w:rtl w:val="0"/>
+              </w:rPr>
+            </w:r>
+          </w:p>
+          <w:p>
+            <w:pPr>
+              <w:spacing w:after="20" w:before="20" w:lineRule="auto"/>
+              <w:rPr>
+                <w:sz w:val="16"/>
+                <w:szCs w:val="16"/>
+              </w:rPr>
+            </w:pPr>
+            <w:r>
+              <w:rPr>
+                <w:sz w:val="16"/>
+                <w:szCs w:val="16"/>
+                <w:rtl w:val="0"/>
+              </w:rPr>
+              <w:t xml:space="preserve">Valid setup 2:</w:t>
+            </w:r>
+          </w:p>
+          <w:p>
+            <w:pPr>
+              <w:spacing w:after="20" w:before="20" w:lineRule="auto"/>
+              <w:rPr>
+                <w:sz w:val="16"/>
+                <w:szCs w:val="16"/>
+              </w:rPr>
+            </w:pPr>
+            <w:r>
+              <w:rPr>
+                <w:sz w:val="16"/>
+                <w:szCs w:val="16"/>
+                <w:rtl w:val="0"/>
+              </w:rPr>
+              <w:t xml:space="preserve">(“zip assessment”, “write three paragraphs”, 1, “zip”, false. “ “, “20/11/2026 09:00”, “23/11/2026 09:00”, “24/11/2026 09:00”)</w:t>
+            </w:r>
+          </w:p>
+          <w:p>
+            <w:pPr>
+              <w:spacing w:after="20" w:before="20" w:lineRule="auto"/>
+              <w:rPr>
+                <w:sz w:val="16"/>
+                <w:szCs w:val="16"/>
+              </w:rPr>
+            </w:pPr>
+            <w:r>
+              <w:rPr>
+                <w:rtl w:val="0"/>
+              </w:rPr>
+            </w:r>
+          </w:p>
+          <w:p>
+            <w:pPr>
+              <w:spacing w:after="20" w:before="20" w:lineRule="auto"/>
+              <w:rPr>
+                <w:sz w:val="16"/>
+                <w:szCs w:val="16"/>
+              </w:rPr>
+            </w:pPr>
+            <w:r>
+              <w:rPr>
+                <w:sz w:val="16"/>
+                <w:szCs w:val="16"/>
+                <w:rtl w:val="0"/>
+              </w:rPr>
+              <w:t xml:space="preserve">Valid setup 3:</w:t>
+            </w:r>
+          </w:p>
+          <w:p>
+            <w:pPr>
+              <w:spacing w:after="20" w:before="20" w:lineRule="auto"/>
+              <w:rPr>
+                <w:sz w:val="16"/>
+                <w:szCs w:val="16"/>
+              </w:rPr>
+            </w:pPr>
+            <w:r>
+              <w:rPr>
+                <w:sz w:val="16"/>
+                <w:szCs w:val="16"/>
+                <w:rtl w:val="0"/>
+              </w:rPr>
+              <w:t xml:space="preserve">(“doc assessment”, “write three paragraphs”, 1, “doc”, false. “ “, “20/11/2026 09:00”, “23/11/2026 09:00”, “24/11/2026 09:00”)</w:t>
+            </w:r>
+          </w:p>
+          <w:p>
+            <w:pPr>
+              <w:spacing w:after="20" w:before="20" w:lineRule="auto"/>
+              <w:rPr>
+                <w:sz w:val="16"/>
+                <w:szCs w:val="16"/>
+              </w:rPr>
+            </w:pPr>
+            <w:r>
+              <w:rPr>
+                <w:rtl w:val="0"/>
+              </w:rPr>
+            </w:r>
+          </w:p>
+          <w:p>
+            <w:pPr>
+              <w:spacing w:after="20" w:before="20" w:lineRule="auto"/>
+              <w:rPr>
+                <w:sz w:val="16"/>
+                <w:szCs w:val="16"/>
+              </w:rPr>
+            </w:pPr>
+            <w:r>
+              <w:rPr>
+                <w:sz w:val="16"/>
+                <w:szCs w:val="16"/>
+                <w:rtl w:val="0"/>
+              </w:rPr>
+              <w:t xml:space="preserve">D1 - unsupported type: </w:t>
+            </w:r>
+          </w:p>
+          <w:p>
+            <w:pPr>
+              <w:spacing w:after="20" w:before="20" w:lineRule="auto"/>
+              <w:rPr>
+                <w:sz w:val="16"/>
+                <w:szCs w:val="16"/>
+              </w:rPr>
+            </w:pPr>
+            <w:r>
+              <w:rPr>
+                <w:sz w:val="16"/>
+                <w:szCs w:val="16"/>
+                <w:rtl w:val="0"/>
+              </w:rPr>
+              <w:t xml:space="preserve">(“invalid assessment”, “write three paragraphs”, 1, “txt”, false. “ “, “20/11/2026 09:00”, “23/11/2026 09:00”, “24/11/2026 09:00”)</w:t>
+            </w:r>
+          </w:p>
+          <w:p>
+            <w:pPr>
+              <w:spacing w:after="20" w:before="20" w:lineRule="auto"/>
+              <w:rPr>
+                <w:sz w:val="16"/>
+                <w:szCs w:val="16"/>
+              </w:rPr>
+            </w:pPr>
+            <w:r>
+              <w:rPr>
+                <w:rtl w:val="0"/>
+              </w:rPr>
+            </w:r>
+          </w:p>
+          <w:p>
+            <w:pPr>
+              <w:spacing w:after="20" w:before="20" w:lineRule="auto"/>
+              <w:rPr>
+                <w:sz w:val="16"/>
+                <w:szCs w:val="16"/>
+              </w:rPr>
+            </w:pPr>
+            <w:r>
+              <w:rPr>
+                <w:sz w:val="16"/>
+                <w:szCs w:val="16"/>
+                <w:rtl w:val="0"/>
+              </w:rPr>
+              <w:t xml:space="preserve">D2 - additional unsupported type check: </w:t>
+            </w:r>
+          </w:p>
+          <w:p>
+            <w:pPr>
+              <w:spacing w:after="20" w:before="20" w:lineRule="auto"/>
+              <w:rPr>
+                <w:sz w:val="16"/>
+                <w:szCs w:val="16"/>
+              </w:rPr>
+            </w:pPr>
+            <w:r>
+              <w:rPr>
+                <w:sz w:val="16"/>
+                <w:szCs w:val="16"/>
+                <w:rtl w:val="0"/>
+              </w:rPr>
+              <w:t xml:space="preserve">(“invalid assessment”, “write three paragraphs”, 1, “docx”, false. “ “, “20/11/2026 09:00”, “23/11/2026 09:00”, “24/11/2026 09:00”)</w:t>
+            </w:r>
+          </w:p>
+          <w:p>
+            <w:pPr>
+              <w:spacing w:after="20" w:before="20" w:lineRule="auto"/>
+              <w:rPr>
+                <w:sz w:val="16"/>
+                <w:szCs w:val="16"/>
+              </w:rPr>
+            </w:pPr>
+            <w:r>
+              <w:rPr>
+                <w:rtl w:val="0"/>
+              </w:rPr>
+            </w:r>
+          </w:p>
+          <w:p>
+            <w:pPr>
+              <w:spacing w:after="20" w:before="20" w:lineRule="auto"/>
+              <w:rPr>
+                <w:sz w:val="16"/>
+                <w:szCs w:val="16"/>
+              </w:rPr>
+            </w:pPr>
+            <w:r>
+              <w:rPr>
+                <w:sz w:val="16"/>
+                <w:szCs w:val="16"/>
+                <w:rtl w:val="0"/>
+              </w:rPr>
+              <w:t xml:space="preserve">D3 - additional empty type check: </w:t>
+            </w:r>
+          </w:p>
+          <w:p>
+            <w:pPr>
+              <w:spacing w:after="20" w:before="20" w:lineRule="auto"/>
+              <w:rPr>
+                <w:sz w:val="16"/>
+                <w:szCs w:val="16"/>
+              </w:rPr>
+            </w:pPr>
+            <w:r>
+              <w:rPr>
+                <w:sz w:val="16"/>
+                <w:szCs w:val="16"/>
+                <w:rtl w:val="0"/>
+              </w:rPr>
+              <w:t xml:space="preserve">(“invalid assessment”, “write three paragraphs”, 1, “ ”, false. “ “, “20/11/2026 09:00”, “23/11/2026 09:00”, “24/11/2026 09:00”)</w:t>
+            </w:r>
+          </w:p>
+          <w:p>
+            <w:pPr>
+              <w:spacing w:after="20" w:before="20" w:lineRule="auto"/>
+              <w:rPr>
+                <w:sz w:val="16"/>
+                <w:szCs w:val="16"/>
+              </w:rPr>
+            </w:pPr>
+            <w:r>
+              <w:rPr>
+                <w:rtl w:val="0"/>
+              </w:rPr>
+            </w:r>
+          </w:p>
+          <w:p>
+            <w:pPr>
+              <w:spacing w:after="20" w:before="20" w:lineRule="auto"/>
+              <w:rPr>
+                <w:sz w:val="16"/>
+                <w:szCs w:val="16"/>
+              </w:rPr>
+            </w:pPr>
+            <w:r>
+              <w:rPr>
+                <w:sz w:val="16"/>
+                <w:szCs w:val="16"/>
+                <w:rtl w:val="0"/>
+              </w:rPr>
+              <w:t xml:space="preserve">D4 - additional null type check: </w:t>
+            </w:r>
+          </w:p>
+          <w:p>
+            <w:pPr>
+              <w:spacing w:after="20" w:before="20" w:lineRule="auto"/>
+              <w:rPr>
+                <w:sz w:val="16"/>
+                <w:szCs w:val="16"/>
+              </w:rPr>
+            </w:pPr>
+            <w:r>
+              <w:rPr>
+                <w:sz w:val="16"/>
+                <w:szCs w:val="16"/>
+                <w:rtl w:val="0"/>
+              </w:rPr>
+              <w:t xml:space="preserve">(“invalid assessment”, “write three paragraphs”, 1, null , false. “ “, “20/11/2026 09:00”, “23/11/2026 09:00”, “24/11/2026 09:00”)</w:t>
+            </w:r>
+          </w:p>
+          <w:p>
+            <w:pPr>
+              <w:spacing w:after="20" w:before="20" w:lineRule="auto"/>
+              <w:rPr>
+                <w:sz w:val="16"/>
+                <w:szCs w:val="16"/>
+              </w:rPr>
+            </w:pPr>
+            <w:r>
+              <w:rPr>
+                <w:rtl w:val="0"/>
+              </w:rPr>
             </w:r>
           </w:p>
         </w:tc>
@@ -785,7 +1748,100 @@
                 <w:szCs w:val="16"/>
                 <w:rtl w:val="0"/>
               </w:rPr>
-              <w:t xml:space="preserve">All three permitted types are accepted and stored correctly. Each invalid attempt returns false; list remains size 3; all existing objects and attributes remain unchanged. </w:t>
+              <w:t xml:space="preserve">Valid setup 1-3: each returns true. The list contains 3 assessments, worth 3 points in total. Every object stores all nine input values, including its matching submission type.</w:t>
+            </w:r>
+          </w:p>
+          <w:p>
+            <w:pPr>
+              <w:spacing w:after="20" w:before="20" w:lineRule="auto"/>
+              <w:rPr>
+                <w:sz w:val="16"/>
+                <w:szCs w:val="16"/>
+              </w:rPr>
+            </w:pPr>
+            <w:r>
+              <w:rPr>
+                <w:rtl w:val="0"/>
+              </w:rPr>
+            </w:r>
+          </w:p>
+          <w:p>
+            <w:pPr>
+              <w:spacing w:after="20" w:before="20" w:lineRule="auto"/>
+              <w:rPr>
+                <w:sz w:val="16"/>
+                <w:szCs w:val="16"/>
+              </w:rPr>
+            </w:pPr>
+            <w:r>
+              <w:rPr>
+                <w:sz w:val="16"/>
+                <w:szCs w:val="16"/>
+                <w:rtl w:val="0"/>
+              </w:rPr>
+              <w:t xml:space="preserve">D1-D4: each call returns false. Run each attempt against the same three valid assessments; rejected attempts must not be added.</w:t>
+            </w:r>
+          </w:p>
+          <w:p>
+            <w:pPr>
+              <w:spacing w:after="20" w:before="20" w:lineRule="auto"/>
+              <w:rPr>
+                <w:sz w:val="16"/>
+                <w:szCs w:val="16"/>
+              </w:rPr>
+            </w:pPr>
+            <w:r>
+              <w:rPr>
+                <w:rtl w:val="0"/>
+              </w:rPr>
+            </w:r>
+          </w:p>
+          <w:p>
+            <w:pPr>
+              <w:spacing w:after="20" w:before="20" w:lineRule="auto"/>
+              <w:rPr>
+                <w:sz w:val="16"/>
+                <w:szCs w:val="16"/>
+              </w:rPr>
+            </w:pPr>
+            <w:r>
+              <w:rPr>
+                <w:sz w:val="16"/>
+                <w:szCs w:val="16"/>
+                <w:rtl w:val="0"/>
+              </w:rPr>
+              <w:t xml:space="preserve">After each rejection, list size remains 3 and total points remain 3. All existing object references, their order and all nine attributes per object remain unchanged. </w:t>
+            </w:r>
+          </w:p>
+          <w:p>
+            <w:pPr>
+              <w:spacing w:after="20" w:before="20" w:lineRule="auto"/>
+              <w:rPr>
+                <w:sz w:val="16"/>
+                <w:szCs w:val="16"/>
+              </w:rPr>
+            </w:pPr>
+            <w:r>
+              <w:rPr>
+                <w:rtl w:val="0"/>
+              </w:rPr>
+            </w:r>
+          </w:p>
+          <w:p>
+            <w:pPr>
+              <w:spacing w:after="20" w:before="20" w:lineRule="auto"/>
+              <w:rPr>
+                <w:sz w:val="16"/>
+                <w:szCs w:val="16"/>
+              </w:rPr>
+            </w:pPr>
+            <w:r>
+              <w:rPr>
+                <w:sz w:val="16"/>
+                <w:szCs w:val="16"/>
+                <w:rtl w:val="0"/>
+              </w:rPr>
+              <w:t xml:space="preserve">The attempted name does not occur in the setup. Each proposed total is 4, so name uniqueness and point limits do not cause rejection.</w:t>
             </w:r>
           </w:p>
         </w:tc>
@@ -819,7 +1875,69 @@
                 <w:szCs w:val="16"/>
                 <w:rtl w:val="0"/>
               </w:rPr>
-              <w:t xml:space="preserve">pdf, zip and doc accepted. All four invalid attempts rejected; list size remained 3; all existing objects and attributes unchanged. </w:t>
+              <w:t xml:space="preserve">Setup: pdf, zi[ and doc each returned true; all fields matched.</w:t>
+            </w:r>
+          </w:p>
+          <w:p>
+            <w:pPr>
+              <w:spacing w:after="20" w:before="20" w:lineRule="auto"/>
+              <w:rPr>
+                <w:sz w:val="16"/>
+                <w:szCs w:val="16"/>
+              </w:rPr>
+            </w:pPr>
+            <w:r>
+              <w:rPr>
+                <w:rtl w:val="0"/>
+              </w:rPr>
+            </w:r>
+          </w:p>
+          <w:p>
+            <w:pPr>
+              <w:spacing w:after="20" w:before="20" w:lineRule="auto"/>
+              <w:rPr>
+                <w:sz w:val="16"/>
+                <w:szCs w:val="16"/>
+              </w:rPr>
+            </w:pPr>
+            <w:r>
+              <w:rPr>
+                <w:sz w:val="16"/>
+                <w:szCs w:val="16"/>
+                <w:rtl w:val="0"/>
+              </w:rPr>
+              <w:t xml:space="preserve">D1-D4: txt, docx, empty and null each returned false.</w:t>
+            </w:r>
+          </w:p>
+          <w:p>
+            <w:pPr>
+              <w:spacing w:after="20" w:before="20" w:lineRule="auto"/>
+              <w:rPr>
+                <w:sz w:val="16"/>
+                <w:szCs w:val="16"/>
+              </w:rPr>
+            </w:pPr>
+            <w:r>
+              <w:rPr>
+                <w:rtl w:val="0"/>
+              </w:rPr>
+            </w:r>
+          </w:p>
+          <w:p>
+            <w:pPr>
+              <w:spacing w:after="20" w:before="20" w:lineRule="auto"/>
+              <w:rPr>
+                <w:sz w:val="16"/>
+                <w:szCs w:val="16"/>
+              </w:rPr>
+            </w:pPr>
+            <w:r>
+              <w:rPr>
+                <w:sz w:val="16"/>
+                <w:szCs w:val="16"/>
+                <w:rtl w:val="0"/>
+              </w:rPr>
+              <w:t xml:space="preserve">After every rejection, size stayed 3; total stayed 3. All objects and nine fields per object were unchanged.</w:t>
             </w:r>
           </w:p>
         </w:tc>
@@ -894,7 +2012,24 @@
                 <w:szCs w:val="16"/>
                 <w:rtl w:val="0"/>
               </w:rPr>
-              <w:t xml:space="preserve">TC08 | Condition 8: grouping name required for group assessments </w:t>
+              <w:t xml:space="preserve">TC08 | Condition 8: </w:t>
+            </w:r>
+          </w:p>
+          <w:p>
+            <w:pPr>
+              <w:spacing w:after="20" w:before="20" w:lineRule="auto"/>
+              <w:rPr>
+                <w:sz w:val="16"/>
+                <w:szCs w:val="16"/>
+              </w:rPr>
+            </w:pPr>
+            <w:r>
+              <w:rPr>
+                <w:sz w:val="16"/>
+                <w:szCs w:val="16"/>
+                <w:rtl w:val="0"/>
+              </w:rPr>
+              <w:t xml:space="preserve">Check the function with a group assessment that has no grouping name.</w:t>
             </w:r>
           </w:p>
         </w:tc>
@@ -928,7 +2063,264 @@
                 <w:szCs w:val="16"/>
                 <w:rtl w:val="0"/>
               </w:rPr>
-              <w:t xml:space="preserve">Store "individual assessment" with group=false, groupingName="". Store "group assessment" with group=true, groupingName="team alpha". Attempt "invalid assessment" with group=true and groupingName="", " " and null separately. Each assessment has 1 point. </w:t>
+              <w:t xml:space="preserve">Precondition: start with an empty course; run the shared independent baseline check. Store both valid inputs below in order.</w:t>
+            </w:r>
+          </w:p>
+          <w:p>
+            <w:pPr>
+              <w:spacing w:after="20" w:before="20" w:lineRule="auto"/>
+              <w:rPr>
+                <w:sz w:val="16"/>
+                <w:szCs w:val="16"/>
+              </w:rPr>
+            </w:pPr>
+            <w:r>
+              <w:rPr>
+                <w:sz w:val="16"/>
+                <w:szCs w:val="16"/>
+                <w:rtl w:val="0"/>
+              </w:rPr>
+              <w:t xml:space="preserve">Valid setup 1:</w:t>
+            </w:r>
+          </w:p>
+          <w:p>
+            <w:pPr>
+              <w:spacing w:after="20" w:before="20" w:lineRule="auto"/>
+              <w:rPr>
+                <w:sz w:val="16"/>
+                <w:szCs w:val="16"/>
+              </w:rPr>
+            </w:pPr>
+            <w:r>
+              <w:rPr>
+                <w:sz w:val="16"/>
+                <w:szCs w:val="16"/>
+                <w:rtl w:val="0"/>
+              </w:rPr>
+              <w:t xml:space="preserve">(“individual assessment”, “write three paragraphs”, 1, “pdf”, false. “ “, “20/11/2026 09:00”, “23/11/2026 09:00”, “24/11/2026 09:00”)</w:t>
+            </w:r>
+          </w:p>
+          <w:p>
+            <w:pPr>
+              <w:spacing w:after="20" w:before="20" w:lineRule="auto"/>
+              <w:rPr>
+                <w:sz w:val="16"/>
+                <w:szCs w:val="16"/>
+              </w:rPr>
+            </w:pPr>
+            <w:r>
+              <w:rPr>
+                <w:rtl w:val="0"/>
+              </w:rPr>
+            </w:r>
+          </w:p>
+          <w:p>
+            <w:pPr>
+              <w:spacing w:after="20" w:before="20" w:lineRule="auto"/>
+              <w:rPr>
+                <w:sz w:val="16"/>
+                <w:szCs w:val="16"/>
+              </w:rPr>
+            </w:pPr>
+            <w:r>
+              <w:rPr>
+                <w:sz w:val="16"/>
+                <w:szCs w:val="16"/>
+                <w:rtl w:val="0"/>
+              </w:rPr>
+              <w:t xml:space="preserve">Valid setup 2:</w:t>
+            </w:r>
+          </w:p>
+          <w:p>
+            <w:pPr>
+              <w:spacing w:after="20" w:before="20" w:lineRule="auto"/>
+              <w:rPr>
+                <w:sz w:val="16"/>
+                <w:szCs w:val="16"/>
+              </w:rPr>
+            </w:pPr>
+            <w:r>
+              <w:rPr>
+                <w:sz w:val="16"/>
+                <w:szCs w:val="16"/>
+                <w:rtl w:val="0"/>
+              </w:rPr>
+              <w:t xml:space="preserve">(“group assessment”, “write three paragraphs”, 1, “pdf”, true. “team alpha “, “20/11/2026 09:00”, “23/11/2026 09:00”, “24/11/2026 09:00”)</w:t>
+            </w:r>
+          </w:p>
+          <w:p>
+            <w:pPr>
+              <w:spacing w:after="20" w:before="20" w:lineRule="auto"/>
+              <w:rPr>
+                <w:sz w:val="16"/>
+                <w:szCs w:val="16"/>
+              </w:rPr>
+            </w:pPr>
+            <w:r>
+              <w:rPr>
+                <w:rtl w:val="0"/>
+              </w:rPr>
+            </w:r>
+          </w:p>
+          <w:p>
+            <w:pPr>
+              <w:spacing w:after="20" w:before="20" w:lineRule="auto"/>
+              <w:rPr>
+                <w:sz w:val="16"/>
+                <w:szCs w:val="16"/>
+              </w:rPr>
+            </w:pPr>
+            <w:r>
+              <w:rPr>
+                <w:sz w:val="16"/>
+                <w:szCs w:val="16"/>
+                <w:rtl w:val="0"/>
+              </w:rPr>
+              <w:t xml:space="preserve">D1 - empty grouping name:</w:t>
+            </w:r>
+          </w:p>
+          <w:p>
+            <w:pPr>
+              <w:spacing w:after="20" w:before="20" w:lineRule="auto"/>
+              <w:rPr>
+                <w:sz w:val="16"/>
+                <w:szCs w:val="16"/>
+              </w:rPr>
+            </w:pPr>
+            <w:r>
+              <w:rPr>
+                <w:sz w:val="16"/>
+                <w:szCs w:val="16"/>
+                <w:rtl w:val="0"/>
+              </w:rPr>
+              <w:t xml:space="preserve">(“invalid assessment”, “write three paragraphs”, 1, “pdf”, true. “ “, “20/11/2026 09:00”, “23/11/2026 09:00”, “24/11/2026 09:00”)</w:t>
+            </w:r>
+          </w:p>
+          <w:p>
+            <w:pPr>
+              <w:spacing w:after="20" w:before="20" w:lineRule="auto"/>
+              <w:rPr>
+                <w:sz w:val="16"/>
+                <w:szCs w:val="16"/>
+              </w:rPr>
+            </w:pPr>
+            <w:r>
+              <w:rPr>
+                <w:rtl w:val="0"/>
+              </w:rPr>
+            </w:r>
+          </w:p>
+          <w:p>
+            <w:pPr>
+              <w:spacing w:after="20" w:before="20" w:lineRule="auto"/>
+              <w:rPr>
+                <w:sz w:val="16"/>
+                <w:szCs w:val="16"/>
+              </w:rPr>
+            </w:pPr>
+            <w:r>
+              <w:rPr>
+                <w:sz w:val="16"/>
+                <w:szCs w:val="16"/>
+                <w:rtl w:val="0"/>
+              </w:rPr>
+              <w:t xml:space="preserve">D2 - additional whitespace only check::</w:t>
+            </w:r>
+          </w:p>
+          <w:p>
+            <w:pPr>
+              <w:spacing w:after="20" w:before="20" w:lineRule="auto"/>
+              <w:rPr>
+                <w:sz w:val="16"/>
+                <w:szCs w:val="16"/>
+              </w:rPr>
+            </w:pPr>
+            <w:r>
+              <w:rPr>
+                <w:sz w:val="16"/>
+                <w:szCs w:val="16"/>
+                <w:rtl w:val="0"/>
+              </w:rPr>
+              <w:t xml:space="preserve">(“invalid assessment”, “write three paragraphs”, 1, “pdf”, true. “ “, “20/11/2026 09:00”, “23/11/2026 09:00”, “24/11/2026 09:00”)</w:t>
+            </w:r>
+          </w:p>
+          <w:p>
+            <w:pPr>
+              <w:spacing w:after="20" w:before="20" w:lineRule="auto"/>
+              <w:rPr>
+                <w:sz w:val="16"/>
+                <w:szCs w:val="16"/>
+              </w:rPr>
+            </w:pPr>
+            <w:r>
+              <w:rPr>
+                <w:rtl w:val="0"/>
+              </w:rPr>
+            </w:r>
+          </w:p>
+          <w:p>
+            <w:pPr>
+              <w:spacing w:after="20" w:before="20" w:lineRule="auto"/>
+              <w:rPr>
+                <w:sz w:val="16"/>
+                <w:szCs w:val="16"/>
+              </w:rPr>
+            </w:pPr>
+            <w:r>
+              <w:rPr>
+                <w:sz w:val="16"/>
+                <w:szCs w:val="16"/>
+                <w:rtl w:val="0"/>
+              </w:rPr>
+              <w:t xml:space="preserve">D3 - additional null name check::</w:t>
+            </w:r>
+          </w:p>
+          <w:p>
+            <w:pPr>
+              <w:spacing w:after="20" w:before="20" w:lineRule="auto"/>
+              <w:rPr>
+                <w:sz w:val="16"/>
+                <w:szCs w:val="16"/>
+              </w:rPr>
+            </w:pPr>
+            <w:r>
+              <w:rPr>
+                <w:sz w:val="16"/>
+                <w:szCs w:val="16"/>
+                <w:rtl w:val="0"/>
+              </w:rPr>
+              <w:t xml:space="preserve">(“invalid assessment”, “write three paragraphs”, 1, “pdf”, true. null, “20/11/2026 09:00”, “23/11/2026 09:00”, “24/11/2026 09:00”)</w:t>
+            </w:r>
+          </w:p>
+          <w:p>
+            <w:pPr>
+              <w:spacing w:after="20" w:before="20" w:lineRule="auto"/>
+              <w:rPr>
+                <w:sz w:val="16"/>
+                <w:szCs w:val="16"/>
+              </w:rPr>
+            </w:pPr>
+            <w:r>
+              <w:rPr>
+                <w:rtl w:val="0"/>
+              </w:rPr>
+            </w:r>
+          </w:p>
+          <w:p>
+            <w:pPr>
+              <w:spacing w:after="20" w:before="20" w:lineRule="auto"/>
+              <w:rPr>
+                <w:sz w:val="16"/>
+                <w:szCs w:val="16"/>
+              </w:rPr>
+            </w:pPr>
+            <w:r>
+              <w:rPr>
+                <w:sz w:val="16"/>
+                <w:szCs w:val="16"/>
+                <w:rtl w:val="0"/>
+              </w:rPr>
+              <w:t xml:space="preserve">In D2, the grouping name contains exactly one space. Each attempted name is unique relative to the stored assessment, the proposed total is only 3 points. </w:t>
             </w:r>
           </w:p>
         </w:tc>
@@ -962,7 +2354,55 @@
                 <w:szCs w:val="16"/>
                 <w:rtl w:val="0"/>
               </w:rPr>
-              <w:t xml:space="preserve">Both valid assessments are accepted and stored correctly. Each group assessment missing a grouping name returns false; list remains size 2; both existing objects and all attributes remain unchanged. </w:t>
+              <w:t xml:space="preserve">Valide setup 1: returns true; an individual assessment is accepted with an empty grouping name.</w:t>
+            </w:r>
+          </w:p>
+          <w:p>
+            <w:pPr>
+              <w:spacing w:after="20" w:before="20" w:lineRule="auto"/>
+              <w:rPr>
+                <w:sz w:val="16"/>
+                <w:szCs w:val="16"/>
+              </w:rPr>
+            </w:pPr>
+            <w:r>
+              <w:rPr>
+                <w:sz w:val="16"/>
+                <w:szCs w:val="16"/>
+                <w:rtl w:val="0"/>
+              </w:rPr>
+              <w:t xml:space="preserve">Valid setup 2: returns true; a grouping assessment is accepted with the grouping name “team alpha”. List size becomes 2; both objects store all nine input values.</w:t>
+            </w:r>
+          </w:p>
+          <w:p>
+            <w:pPr>
+              <w:spacing w:after="20" w:before="20" w:lineRule="auto"/>
+              <w:rPr>
+                <w:sz w:val="16"/>
+                <w:szCs w:val="16"/>
+              </w:rPr>
+            </w:pPr>
+            <w:r>
+              <w:rPr>
+                <w:rtl w:val="0"/>
+              </w:rPr>
+            </w:r>
+          </w:p>
+          <w:p>
+            <w:pPr>
+              <w:spacing w:after="20" w:before="20" w:lineRule="auto"/>
+              <w:rPr>
+                <w:sz w:val="16"/>
+                <w:szCs w:val="16"/>
+              </w:rPr>
+            </w:pPr>
+            <w:r>
+              <w:rPr>
+                <w:sz w:val="16"/>
+                <w:szCs w:val="16"/>
+                <w:rtl w:val="0"/>
+              </w:rPr>
+              <w:t xml:space="preserve">D1-D3: each returns false. After each attempt, list size remains 2 and total points remain 2. No new assessment is stored; both existing object references, their order and all nine attributes remain unchanged.</w:t>
             </w:r>
           </w:p>
         </w:tc>
@@ -996,7 +2436,69 @@
                 <w:szCs w:val="16"/>
                 <w:rtl w:val="0"/>
               </w:rPr>
-              <w:t xml:space="preserve">Both valid assessments accepted. All three invalid attempts rejected; list size remained 2; both existing objects and all attributes unchanged. </w:t>
+              <w:t xml:space="preserve">Setup: individual with empty grouping name and group with team alpha both returned true; all fields matched.</w:t>
+            </w:r>
+          </w:p>
+          <w:p>
+            <w:pPr>
+              <w:spacing w:after="20" w:before="20" w:lineRule="auto"/>
+              <w:rPr>
+                <w:sz w:val="16"/>
+                <w:szCs w:val="16"/>
+              </w:rPr>
+            </w:pPr>
+            <w:r>
+              <w:rPr>
+                <w:rtl w:val="0"/>
+              </w:rPr>
+            </w:r>
+          </w:p>
+          <w:p>
+            <w:pPr>
+              <w:spacing w:after="20" w:before="20" w:lineRule="auto"/>
+              <w:rPr>
+                <w:sz w:val="16"/>
+                <w:szCs w:val="16"/>
+              </w:rPr>
+            </w:pPr>
+            <w:r>
+              <w:rPr>
+                <w:sz w:val="16"/>
+                <w:szCs w:val="16"/>
+                <w:rtl w:val="0"/>
+              </w:rPr>
+              <w:t xml:space="preserve">D1-D3: empty, one space and all null each returned false.</w:t>
+            </w:r>
+          </w:p>
+          <w:p>
+            <w:pPr>
+              <w:spacing w:after="20" w:before="20" w:lineRule="auto"/>
+              <w:rPr>
+                <w:sz w:val="16"/>
+                <w:szCs w:val="16"/>
+              </w:rPr>
+            </w:pPr>
+            <w:r>
+              <w:rPr>
+                <w:rtl w:val="0"/>
+              </w:rPr>
+            </w:r>
+          </w:p>
+          <w:p>
+            <w:pPr>
+              <w:spacing w:after="20" w:before="20" w:lineRule="auto"/>
+              <w:rPr>
+                <w:sz w:val="16"/>
+                <w:szCs w:val="16"/>
+              </w:rPr>
+            </w:pPr>
+            <w:r>
+              <w:rPr>
+                <w:sz w:val="16"/>
+                <w:szCs w:val="16"/>
+                <w:rtl w:val="0"/>
+              </w:rPr>
+              <w:t xml:space="preserve">Size stayed 2: total stayed 2. Both objects and all nine fields were unchanged.</w:t>
             </w:r>
           </w:p>
         </w:tc>
@@ -1036,49 +2538,6 @@
         </w:tc>
       </w:tr>
     </w:tbl>
-    <w:p>
-      <w:pPr>
-        <w:spacing w:after="100" w:lineRule="auto"/>
-        <w:rPr/>
-      </w:pPr>
-      <w:r>
-        <w:rPr>
-          <w:rtl w:val="0"/>
-        </w:rPr>
-      </w:r>
-    </w:p>
-    <w:p>
-      <w:pPr>
-        <w:spacing w:after="240" w:before="240" w:lineRule="auto"/>
-        <w:rPr/>
-      </w:pPr>
-      <w:r>
-        <w:rPr>
-          <w:b w:val="1"/>
-          <w:bCs w:val="1"/>
-          <w:rtl w:val="0"/>
-        </w:rPr>
-        <w:t xml:space="preserve">Execution record:</w:t>
-      </w:r>
-      <w:r>
-        <w:rPr>
-          <w:rtl w:val="0"/>
-        </w:rPr>
-        <w:t xml:space="preserve"> All four cases passed in the assistant’s JUnit 5 run. The complete run, including TC01–TC04, passed all 8 tests. Execution in Eclipse by the student has not yet been recorded.</w:t>
-      </w:r>
-    </w:p>
-    <w:p>
-      <w:pPr>
-        <w:spacing w:after="240" w:before="240" w:lineRule="auto"/>
-        <w:rPr/>
-      </w:pPr>
-      <w:r>
-        <w:rPr>
-          <w:rtl w:val="0"/>
-        </w:rPr>
-        <w:t xml:space="preserve">These four cases cover your individual conditions 5–8 and form part of the group’s required minimum of 12 test cases.</w:t>
-      </w:r>
-    </w:p>
     <w:p>
       <w:pPr>
         <w:rPr/>

</xml_diff>